<commit_message>
Refactor packages and expand tower upgrades
Organize game classes into enemies, GUI, pathfinding, and tower packages; update the Maven entry point and imports. Add per-tower damage and range progression, adjust firing and placement behavior, start with more gold, and increase enemy upgrade frequency.
</commit_message>
<xml_diff>
--- a/CS-Tower-Defense/documents/Backlog_CBL.docx
+++ b/CS-Tower-Defense/documents/Backlog_CBL.docx
@@ -12,7 +12,7 @@
         <w:rPr>
           <w:lang w:val="en-US"/>
         </w:rPr>
-        <w:t>Possible advanced topic: Pathfinding (A*)</w:t>
+        <w:t>Possible advanced topics: Pathfinding (A*)</w:t>
       </w:r>
       <w:r>
         <w:rPr>
@@ -189,7 +189,7 @@
               <w:rPr>
                 <w:lang w:val="en-US"/>
               </w:rPr>
-              <w:t>Display a 11x9 grid with the sprite of each cell being visible.</w:t>
+              <w:t>Display an 11x9 grid with the sprite of each cell being visible.</w:t>
             </w:r>
           </w:p>
         </w:tc>
@@ -245,7 +245,19 @@
               <w:rPr>
                 <w:lang w:val="en-US"/>
               </w:rPr>
-              <w:t>The player chooses a tower by clicking on it in the available towers. They click on a cell.</w:t>
+              <w:t>The player chooses a tower</w:t>
+            </w:r>
+            <w:r>
+              <w:rPr>
+                <w:lang w:val="en-US"/>
+              </w:rPr>
+              <w:t xml:space="preserve"> at the bottom</w:t>
+            </w:r>
+            <w:r>
+              <w:rPr>
+                <w:lang w:val="en-US"/>
+              </w:rPr>
+              <w:t>. They click on a cell.</w:t>
             </w:r>
             <w:r>
               <w:rPr>
@@ -322,7 +334,7 @@
               <w:rPr>
                 <w:lang w:val="en-US"/>
               </w:rPr>
-              <w:t xml:space="preserve"> be placed in the first column and in the last column.</w:t>
+              <w:t xml:space="preserve"> be placed in the first column.</w:t>
             </w:r>
           </w:p>
           <w:p>
@@ -348,14 +360,12 @@
               </w:rPr>
               <w:t xml:space="preserve"> is still possible when placing a tower in a cell. If not, the tower is not </w:t>
             </w:r>
-            <w:proofErr w:type="spellStart"/>
-            <w:r>
-              <w:rPr>
-                <w:lang w:val="en-US"/>
-              </w:rPr>
-              <w:t>placable</w:t>
-            </w:r>
-            <w:proofErr w:type="spellEnd"/>
+            <w:r>
+              <w:rPr>
+                <w:lang w:val="en-US"/>
+              </w:rPr>
+              <w:t>placeable</w:t>
+            </w:r>
             <w:r>
               <w:rPr>
                 <w:lang w:val="en-US"/>
@@ -378,7 +388,7 @@
               <w:rPr>
                 <w:lang w:val="en-US"/>
               </w:rPr>
-              <w:t>Placing a tower cost money. The tower is placed if the player has enough money.</w:t>
+              <w:t>Placing a tower costs money. The tower is placed if the player has enough money.</w:t>
             </w:r>
           </w:p>
         </w:tc>
@@ -508,7 +518,7 @@
               <w:rPr>
                 <w:lang w:val="en-US"/>
               </w:rPr>
-              <w:t>Place a tower. The tower shoots at the closest enemy when they are close enough.</w:t>
+              <w:t>Place a tower. The tower shoots at the closest enemy when it is close enough.</w:t>
             </w:r>
           </w:p>
         </w:tc>
@@ -531,9 +541,76 @@
               <w:rPr>
                 <w:lang w:val="en-US"/>
               </w:rPr>
-              <w:t>The tower should orientate itself towards the closest enemy.</w:t>
-            </w:r>
-          </w:p>
+              <w:t xml:space="preserve">Bullets that go towards </w:t>
+            </w:r>
+            <w:r>
+              <w:rPr>
+                <w:lang w:val="en-US"/>
+              </w:rPr>
+              <w:t>the enemy should be visible and should disappear when touching the enemy.</w:t>
+            </w:r>
+          </w:p>
+        </w:tc>
+      </w:tr>
+      <w:tr>
+        <w:tc>
+          <w:tcPr>
+            <w:tcW w:w="473" w:type="dxa"/>
+          </w:tcPr>
+          <w:p>
+            <w:pPr>
+              <w:rPr>
+                <w:lang w:val="en-US"/>
+              </w:rPr>
+            </w:pPr>
+            <w:r>
+              <w:rPr>
+                <w:lang w:val="en-US"/>
+              </w:rPr>
+              <w:t>5</w:t>
+            </w:r>
+          </w:p>
+        </w:tc>
+        <w:tc>
+          <w:tcPr>
+            <w:tcW w:w="1507" w:type="dxa"/>
+          </w:tcPr>
+          <w:p>
+            <w:pPr>
+              <w:rPr>
+                <w:lang w:val="en-US"/>
+              </w:rPr>
+            </w:pPr>
+            <w:r>
+              <w:rPr>
+                <w:lang w:val="en-US"/>
+              </w:rPr>
+              <w:t>Pathfinding for enemies</w:t>
+            </w:r>
+          </w:p>
+        </w:tc>
+        <w:tc>
+          <w:tcPr>
+            <w:tcW w:w="3402" w:type="dxa"/>
+          </w:tcPr>
+          <w:p>
+            <w:pPr>
+              <w:rPr>
+                <w:lang w:val="en-US"/>
+              </w:rPr>
+            </w:pPr>
+            <w:r>
+              <w:rPr>
+                <w:lang w:val="en-US"/>
+              </w:rPr>
+              <w:t>Launch the game. Enemies find a path to go towards the last column.</w:t>
+            </w:r>
+          </w:p>
+        </w:tc>
+        <w:tc>
+          <w:tcPr>
+            <w:tcW w:w="3680" w:type="dxa"/>
+          </w:tcPr>
           <w:p>
             <w:pPr>
               <w:pStyle w:val="Paragraphedeliste"/>
@@ -549,76 +626,9 @@
               <w:rPr>
                 <w:lang w:val="en-US"/>
               </w:rPr>
-              <w:t xml:space="preserve">Bullets that go towards </w:t>
-            </w:r>
-            <w:r>
-              <w:rPr>
-                <w:lang w:val="en-US"/>
-              </w:rPr>
-              <w:t>the enemy should be visible and should disappear when touching the enemy.</w:t>
-            </w:r>
-          </w:p>
-        </w:tc>
-      </w:tr>
-      <w:tr>
-        <w:tc>
-          <w:tcPr>
-            <w:tcW w:w="473" w:type="dxa"/>
-          </w:tcPr>
-          <w:p>
-            <w:pPr>
-              <w:rPr>
-                <w:lang w:val="en-US"/>
-              </w:rPr>
-            </w:pPr>
-            <w:r>
-              <w:rPr>
-                <w:lang w:val="en-US"/>
-              </w:rPr>
-              <w:t>5</w:t>
-            </w:r>
-          </w:p>
-        </w:tc>
-        <w:tc>
-          <w:tcPr>
-            <w:tcW w:w="1507" w:type="dxa"/>
-          </w:tcPr>
-          <w:p>
-            <w:pPr>
-              <w:rPr>
-                <w:lang w:val="en-US"/>
-              </w:rPr>
-            </w:pPr>
-            <w:r>
-              <w:rPr>
-                <w:lang w:val="en-US"/>
-              </w:rPr>
-              <w:t>Pathfinding for enemies</w:t>
-            </w:r>
-          </w:p>
-        </w:tc>
-        <w:tc>
-          <w:tcPr>
-            <w:tcW w:w="3402" w:type="dxa"/>
-          </w:tcPr>
-          <w:p>
-            <w:pPr>
-              <w:rPr>
-                <w:lang w:val="en-US"/>
-              </w:rPr>
-            </w:pPr>
-            <w:r>
-              <w:rPr>
-                <w:lang w:val="en-US"/>
-              </w:rPr>
-              <w:t>Launch the game. Enemies find a path to go towards the last column.</w:t>
-            </w:r>
-          </w:p>
-        </w:tc>
-        <w:tc>
-          <w:tcPr>
-            <w:tcW w:w="3680" w:type="dxa"/>
-          </w:tcPr>
+              <w:t xml:space="preserve">A* is used. </w:t>
+            </w:r>
+          </w:p>
           <w:p>
             <w:pPr>
               <w:pStyle w:val="Paragraphedeliste"/>
@@ -634,7 +644,7 @@
               <w:rPr>
                 <w:lang w:val="en-US"/>
               </w:rPr>
-              <w:t xml:space="preserve">A* is used. </w:t>
+              <w:t xml:space="preserve">Each cell is a node. </w:t>
             </w:r>
           </w:p>
           <w:p>
@@ -652,9 +662,82 @@
               <w:rPr>
                 <w:lang w:val="en-US"/>
               </w:rPr>
-              <w:t xml:space="preserve">Each cell is a node. </w:t>
-            </w:r>
-          </w:p>
+              <w:t xml:space="preserve">The heuristic is calculated using the </w:t>
+            </w:r>
+            <w:r>
+              <w:rPr>
+                <w:lang w:val="en-US"/>
+              </w:rPr>
+              <w:t>Manhattan</w:t>
+            </w:r>
+            <w:r>
+              <w:rPr>
+                <w:lang w:val="en-US"/>
+              </w:rPr>
+              <w:t xml:space="preserve"> distance.</w:t>
+            </w:r>
+          </w:p>
+        </w:tc>
+      </w:tr>
+      <w:tr>
+        <w:tc>
+          <w:tcPr>
+            <w:tcW w:w="473" w:type="dxa"/>
+          </w:tcPr>
+          <w:p>
+            <w:pPr>
+              <w:rPr>
+                <w:lang w:val="en-US"/>
+              </w:rPr>
+            </w:pPr>
+            <w:r>
+              <w:rPr>
+                <w:lang w:val="en-US"/>
+              </w:rPr>
+              <w:t>6</w:t>
+            </w:r>
+          </w:p>
+        </w:tc>
+        <w:tc>
+          <w:tcPr>
+            <w:tcW w:w="1507" w:type="dxa"/>
+          </w:tcPr>
+          <w:p>
+            <w:pPr>
+              <w:rPr>
+                <w:lang w:val="en-US"/>
+              </w:rPr>
+            </w:pPr>
+            <w:r>
+              <w:rPr>
+                <w:lang w:val="en-US"/>
+              </w:rPr>
+              <w:t>Economy system</w:t>
+            </w:r>
+          </w:p>
+        </w:tc>
+        <w:tc>
+          <w:tcPr>
+            <w:tcW w:w="3402" w:type="dxa"/>
+          </w:tcPr>
+          <w:p>
+            <w:pPr>
+              <w:rPr>
+                <w:lang w:val="en-US"/>
+              </w:rPr>
+            </w:pPr>
+            <w:r>
+              <w:rPr>
+                <w:lang w:val="en-US"/>
+              </w:rPr>
+              <w:t>Place a tower. When an enemy is killed by a tower, the player gains money.</w:t>
+            </w:r>
+          </w:p>
+        </w:tc>
+        <w:tc>
+          <w:tcPr>
+            <w:tcW w:w="3680" w:type="dxa"/>
+          </w:tcPr>
           <w:p>
             <w:pPr>
               <w:pStyle w:val="Paragraphedeliste"/>
@@ -670,82 +753,9 @@
               <w:rPr>
                 <w:lang w:val="en-US"/>
               </w:rPr>
-              <w:t xml:space="preserve">Heuristic is calculated using the </w:t>
-            </w:r>
-            <w:r>
-              <w:rPr>
-                <w:lang w:val="en-US"/>
-              </w:rPr>
-              <w:t>Euclidean</w:t>
-            </w:r>
-            <w:r>
-              <w:rPr>
-                <w:lang w:val="en-US"/>
-              </w:rPr>
-              <w:t xml:space="preserve"> distance.</w:t>
-            </w:r>
-          </w:p>
-        </w:tc>
-      </w:tr>
-      <w:tr>
-        <w:tc>
-          <w:tcPr>
-            <w:tcW w:w="473" w:type="dxa"/>
-          </w:tcPr>
-          <w:p>
-            <w:pPr>
-              <w:rPr>
-                <w:lang w:val="en-US"/>
-              </w:rPr>
-            </w:pPr>
-            <w:r>
-              <w:rPr>
-                <w:lang w:val="en-US"/>
-              </w:rPr>
-              <w:t>6</w:t>
-            </w:r>
-          </w:p>
-        </w:tc>
-        <w:tc>
-          <w:tcPr>
-            <w:tcW w:w="1507" w:type="dxa"/>
-          </w:tcPr>
-          <w:p>
-            <w:pPr>
-              <w:rPr>
-                <w:lang w:val="en-US"/>
-              </w:rPr>
-            </w:pPr>
-            <w:r>
-              <w:rPr>
-                <w:lang w:val="en-US"/>
-              </w:rPr>
-              <w:t>Economy system</w:t>
-            </w:r>
-          </w:p>
-        </w:tc>
-        <w:tc>
-          <w:tcPr>
-            <w:tcW w:w="3402" w:type="dxa"/>
-          </w:tcPr>
-          <w:p>
-            <w:pPr>
-              <w:rPr>
-                <w:lang w:val="en-US"/>
-              </w:rPr>
-            </w:pPr>
-            <w:r>
-              <w:rPr>
-                <w:lang w:val="en-US"/>
-              </w:rPr>
-              <w:t>Place a tower. When an enemy is killed by a tower, the player gains money.</w:t>
-            </w:r>
-          </w:p>
-        </w:tc>
-        <w:tc>
-          <w:tcPr>
-            <w:tcW w:w="3680" w:type="dxa"/>
-          </w:tcPr>
+              <w:t>The amount of money the player has is displayed in the bottom right of the window.</w:t>
+            </w:r>
+          </w:p>
           <w:p>
             <w:pPr>
               <w:pStyle w:val="Paragraphedeliste"/>
@@ -761,7 +771,19 @@
               <w:rPr>
                 <w:lang w:val="en-US"/>
               </w:rPr>
-              <w:t>The amount of money the player has is displayed on the bottom right of the window.</w:t>
+              <w:t xml:space="preserve">The player starts with </w:t>
+            </w:r>
+            <w:r>
+              <w:rPr>
+                <w:lang w:val="en-US"/>
+              </w:rPr>
+              <w:t>30 gold</w:t>
+            </w:r>
+            <w:r>
+              <w:rPr>
+                <w:lang w:val="en-US"/>
+              </w:rPr>
+              <w:t>.</w:t>
             </w:r>
           </w:p>
           <w:p>
@@ -779,7 +801,7 @@
               <w:rPr>
                 <w:lang w:val="en-US"/>
               </w:rPr>
-              <w:t>The player starts with 100$.</w:t>
+              <w:t>Each tower placement and upgrade costs money.</w:t>
             </w:r>
           </w:p>
           <w:p>
@@ -797,7 +819,308 @@
               <w:rPr>
                 <w:lang w:val="en-US"/>
               </w:rPr>
-              <w:t>Each tower placement and upgrade cost money.</w:t>
+              <w:t>The amount of money gained from killing an enemy is the</w:t>
+            </w:r>
+            <w:r>
+              <w:rPr>
+                <w:lang w:val="en-US"/>
+              </w:rPr>
+              <w:t xml:space="preserve"> max HP of the enemy for normal enemies and 2 times that for other types of enemies</w:t>
+            </w:r>
+            <w:r>
+              <w:rPr>
+                <w:lang w:val="en-US"/>
+              </w:rPr>
+              <w:t>.</w:t>
+            </w:r>
+          </w:p>
+        </w:tc>
+      </w:tr>
+      <w:tr>
+        <w:tc>
+          <w:tcPr>
+            <w:tcW w:w="473" w:type="dxa"/>
+          </w:tcPr>
+          <w:p>
+            <w:pPr>
+              <w:rPr>
+                <w:lang w:val="en-US"/>
+              </w:rPr>
+            </w:pPr>
+            <w:r>
+              <w:rPr>
+                <w:lang w:val="en-US"/>
+              </w:rPr>
+              <w:lastRenderedPageBreak/>
+              <w:t>7</w:t>
+            </w:r>
+          </w:p>
+        </w:tc>
+        <w:tc>
+          <w:tcPr>
+            <w:tcW w:w="1507" w:type="dxa"/>
+          </w:tcPr>
+          <w:p>
+            <w:pPr>
+              <w:rPr>
+                <w:lang w:val="en-US"/>
+              </w:rPr>
+            </w:pPr>
+            <w:r>
+              <w:rPr>
+                <w:lang w:val="en-US"/>
+              </w:rPr>
+              <w:t xml:space="preserve">Track amount of time </w:t>
+            </w:r>
+            <w:r>
+              <w:rPr>
+                <w:lang w:val="en-US"/>
+              </w:rPr>
+              <w:t>survived</w:t>
+            </w:r>
+          </w:p>
+        </w:tc>
+        <w:tc>
+          <w:tcPr>
+            <w:tcW w:w="3402" w:type="dxa"/>
+          </w:tcPr>
+          <w:p>
+            <w:pPr>
+              <w:rPr>
+                <w:lang w:val="en-US"/>
+              </w:rPr>
+            </w:pPr>
+            <w:r>
+              <w:rPr>
+                <w:lang w:val="en-US"/>
+              </w:rPr>
+              <w:t xml:space="preserve">Launch the game. The amount of time </w:t>
+            </w:r>
+            <w:r>
+              <w:rPr>
+                <w:lang w:val="en-US"/>
+              </w:rPr>
+              <w:t>survived</w:t>
+            </w:r>
+            <w:r>
+              <w:rPr>
+                <w:lang w:val="en-US"/>
+              </w:rPr>
+              <w:t xml:space="preserve"> is displayed in the bottom left of the window.</w:t>
+            </w:r>
+          </w:p>
+        </w:tc>
+        <w:tc>
+          <w:tcPr>
+            <w:tcW w:w="3680" w:type="dxa"/>
+          </w:tcPr>
+          <w:p>
+            <w:pPr>
+              <w:rPr>
+                <w:lang w:val="en-US"/>
+              </w:rPr>
+            </w:pPr>
+            <w:r>
+              <w:rPr>
+                <w:lang w:val="en-US"/>
+              </w:rPr>
+              <w:t xml:space="preserve">The amount of time </w:t>
+            </w:r>
+            <w:r>
+              <w:rPr>
+                <w:lang w:val="en-US"/>
+              </w:rPr>
+              <w:t>survived</w:t>
+            </w:r>
+            <w:r>
+              <w:rPr>
+                <w:lang w:val="en-US"/>
+              </w:rPr>
+              <w:t xml:space="preserve"> represents the score of the player.</w:t>
+            </w:r>
+            <w:r>
+              <w:rPr>
+                <w:lang w:val="en-US"/>
+              </w:rPr>
+              <w:t xml:space="preserve"> It gives them the possibility to compare their score to the previous rounds they have played, especially since the game is infinite.</w:t>
+            </w:r>
+          </w:p>
+        </w:tc>
+      </w:tr>
+      <w:tr>
+        <w:tc>
+          <w:tcPr>
+            <w:tcW w:w="473" w:type="dxa"/>
+          </w:tcPr>
+          <w:p>
+            <w:pPr>
+              <w:rPr>
+                <w:lang w:val="en-US"/>
+              </w:rPr>
+            </w:pPr>
+            <w:r>
+              <w:rPr>
+                <w:lang w:val="en-US"/>
+              </w:rPr>
+              <w:t>8</w:t>
+            </w:r>
+          </w:p>
+        </w:tc>
+        <w:tc>
+          <w:tcPr>
+            <w:tcW w:w="1507" w:type="dxa"/>
+          </w:tcPr>
+          <w:p>
+            <w:pPr>
+              <w:rPr>
+                <w:lang w:val="en-US"/>
+              </w:rPr>
+            </w:pPr>
+            <w:r>
+              <w:rPr>
+                <w:lang w:val="en-US"/>
+              </w:rPr>
+              <w:t>Lose when HP reaches 0</w:t>
+            </w:r>
+          </w:p>
+        </w:tc>
+        <w:tc>
+          <w:tcPr>
+            <w:tcW w:w="3402" w:type="dxa"/>
+          </w:tcPr>
+          <w:p>
+            <w:pPr>
+              <w:rPr>
+                <w:lang w:val="en-US"/>
+              </w:rPr>
+            </w:pPr>
+            <w:r>
+              <w:rPr>
+                <w:lang w:val="en-US"/>
+              </w:rPr>
+              <w:t>Let the enemies reach the last column of the grid. When the HP reaches 0, the application displays a game over screen with the amount of time survived.</w:t>
+            </w:r>
+          </w:p>
+        </w:tc>
+        <w:tc>
+          <w:tcPr>
+            <w:tcW w:w="3680" w:type="dxa"/>
+          </w:tcPr>
+          <w:p>
+            <w:pPr>
+              <w:rPr>
+                <w:lang w:val="en-US"/>
+              </w:rPr>
+            </w:pPr>
+            <w:r>
+              <w:rPr>
+                <w:lang w:val="en-US"/>
+              </w:rPr>
+              <w:t xml:space="preserve">The HP of the player is displayed at the top. When an enemy reaches the last column of the grid, </w:t>
+            </w:r>
+            <w:r>
+              <w:rPr>
+                <w:lang w:val="en-US"/>
+              </w:rPr>
+              <w:t>the amount of HP that enemy had is removed from the HP of the player.</w:t>
+            </w:r>
+          </w:p>
+        </w:tc>
+      </w:tr>
+      <w:tr>
+        <w:tc>
+          <w:tcPr>
+            <w:tcW w:w="473" w:type="dxa"/>
+          </w:tcPr>
+          <w:p>
+            <w:pPr>
+              <w:rPr>
+                <w:lang w:val="en-US"/>
+              </w:rPr>
+            </w:pPr>
+            <w:r>
+              <w:rPr>
+                <w:lang w:val="en-US"/>
+              </w:rPr>
+              <w:t>9</w:t>
+            </w:r>
+          </w:p>
+        </w:tc>
+        <w:tc>
+          <w:tcPr>
+            <w:tcW w:w="1507" w:type="dxa"/>
+          </w:tcPr>
+          <w:p>
+            <w:pPr>
+              <w:rPr>
+                <w:lang w:val="en-US"/>
+              </w:rPr>
+            </w:pPr>
+            <w:r>
+              <w:rPr>
+                <w:lang w:val="en-US"/>
+              </w:rPr>
+              <w:t>Upgrade for towers</w:t>
+            </w:r>
+          </w:p>
+        </w:tc>
+        <w:tc>
+          <w:tcPr>
+            <w:tcW w:w="3402" w:type="dxa"/>
+          </w:tcPr>
+          <w:p>
+            <w:pPr>
+              <w:rPr>
+                <w:lang w:val="en-US"/>
+              </w:rPr>
+            </w:pPr>
+            <w:r>
+              <w:rPr>
+                <w:lang w:val="en-US"/>
+              </w:rPr>
+              <w:t xml:space="preserve">Place a tower. </w:t>
+            </w:r>
+            <w:r>
+              <w:rPr>
+                <w:lang w:val="en-US"/>
+              </w:rPr>
+              <w:t>Right-click</w:t>
+            </w:r>
+            <w:r>
+              <w:rPr>
+                <w:lang w:val="en-US"/>
+              </w:rPr>
+              <w:t xml:space="preserve"> on it. An “Upgrade” button showing how much it costs is displayed.</w:t>
+            </w:r>
+            <w:r>
+              <w:rPr>
+                <w:lang w:val="en-US"/>
+              </w:rPr>
+              <w:t xml:space="preserve"> The level of the tower should also be displayed</w:t>
+            </w:r>
+            <w:r>
+              <w:rPr>
+                <w:lang w:val="en-US"/>
+              </w:rPr>
+              <w:t>.</w:t>
+            </w:r>
+          </w:p>
+        </w:tc>
+        <w:tc>
+          <w:tcPr>
+            <w:tcW w:w="3680" w:type="dxa"/>
+          </w:tcPr>
+          <w:p>
+            <w:pPr>
+              <w:rPr>
+                <w:lang w:val="en-US"/>
+              </w:rPr>
+            </w:pPr>
+            <w:r>
+              <w:rPr>
+                <w:lang w:val="en-US"/>
+              </w:rPr>
+              <w:t>Upgrade tower:</w:t>
             </w:r>
           </w:p>
           <w:p>
@@ -815,14 +1138,7 @@
               <w:rPr>
                 <w:lang w:val="en-US"/>
               </w:rPr>
-              <w:t xml:space="preserve">The amount of money gained from killing an </w:t>
-            </w:r>
-            <w:r>
-              <w:rPr>
-                <w:lang w:val="en-US"/>
-              </w:rPr>
-              <w:lastRenderedPageBreak/>
-              <w:t>enemy is the same for all enemies of the same type.</w:t>
+              <w:t>+Range</w:t>
             </w:r>
           </w:p>
           <w:p>
@@ -840,314 +1156,7 @@
               <w:rPr>
                 <w:lang w:val="en-US"/>
               </w:rPr>
-              <w:t xml:space="preserve">Each type of enemies </w:t>
-            </w:r>
-            <w:proofErr w:type="gramStart"/>
-            <w:r>
-              <w:rPr>
-                <w:lang w:val="en-US"/>
-              </w:rPr>
-              <w:t>give</w:t>
-            </w:r>
-            <w:proofErr w:type="gramEnd"/>
-            <w:r>
-              <w:rPr>
-                <w:lang w:val="en-US"/>
-              </w:rPr>
-              <w:t xml:space="preserve"> a different amount of money.</w:t>
-            </w:r>
-          </w:p>
-        </w:tc>
-      </w:tr>
-      <w:tr>
-        <w:tc>
-          <w:tcPr>
-            <w:tcW w:w="473" w:type="dxa"/>
-          </w:tcPr>
-          <w:p>
-            <w:pPr>
-              <w:rPr>
-                <w:lang w:val="en-US"/>
-              </w:rPr>
-            </w:pPr>
-            <w:r>
-              <w:rPr>
-                <w:lang w:val="en-US"/>
-              </w:rPr>
-              <w:lastRenderedPageBreak/>
-              <w:t>7</w:t>
-            </w:r>
-          </w:p>
-        </w:tc>
-        <w:tc>
-          <w:tcPr>
-            <w:tcW w:w="1507" w:type="dxa"/>
-          </w:tcPr>
-          <w:p>
-            <w:pPr>
-              <w:rPr>
-                <w:lang w:val="en-US"/>
-              </w:rPr>
-            </w:pPr>
-            <w:r>
-              <w:rPr>
-                <w:lang w:val="en-US"/>
-              </w:rPr>
-              <w:t xml:space="preserve">Track amount of time </w:t>
-            </w:r>
-            <w:r>
-              <w:rPr>
-                <w:lang w:val="en-US"/>
-              </w:rPr>
-              <w:t>survived</w:t>
-            </w:r>
-          </w:p>
-        </w:tc>
-        <w:tc>
-          <w:tcPr>
-            <w:tcW w:w="3402" w:type="dxa"/>
-          </w:tcPr>
-          <w:p>
-            <w:pPr>
-              <w:rPr>
-                <w:lang w:val="en-US"/>
-              </w:rPr>
-            </w:pPr>
-            <w:r>
-              <w:rPr>
-                <w:lang w:val="en-US"/>
-              </w:rPr>
-              <w:t xml:space="preserve">Launch the game. The amount of time </w:t>
-            </w:r>
-            <w:r>
-              <w:rPr>
-                <w:lang w:val="en-US"/>
-              </w:rPr>
-              <w:t>survived</w:t>
-            </w:r>
-            <w:r>
-              <w:rPr>
-                <w:lang w:val="en-US"/>
-              </w:rPr>
-              <w:t xml:space="preserve"> is displayed on the bottom left of the window.</w:t>
-            </w:r>
-          </w:p>
-        </w:tc>
-        <w:tc>
-          <w:tcPr>
-            <w:tcW w:w="3680" w:type="dxa"/>
-          </w:tcPr>
-          <w:p>
-            <w:pPr>
-              <w:rPr>
-                <w:lang w:val="en-US"/>
-              </w:rPr>
-            </w:pPr>
-            <w:r>
-              <w:rPr>
-                <w:lang w:val="en-US"/>
-              </w:rPr>
-              <w:t xml:space="preserve">The amount of time </w:t>
-            </w:r>
-            <w:r>
-              <w:rPr>
-                <w:lang w:val="en-US"/>
-              </w:rPr>
-              <w:t>survived</w:t>
-            </w:r>
-            <w:r>
-              <w:rPr>
-                <w:lang w:val="en-US"/>
-              </w:rPr>
-              <w:t xml:space="preserve"> represent the score of the player.</w:t>
-            </w:r>
-            <w:r>
-              <w:rPr>
-                <w:lang w:val="en-US"/>
-              </w:rPr>
-              <w:t xml:space="preserve"> It gives them the possibility to compare their score to the previous rounds they have played especially since the game is infinite.</w:t>
-            </w:r>
-          </w:p>
-        </w:tc>
-      </w:tr>
-      <w:tr>
-        <w:tc>
-          <w:tcPr>
-            <w:tcW w:w="473" w:type="dxa"/>
-          </w:tcPr>
-          <w:p>
-            <w:pPr>
-              <w:rPr>
-                <w:lang w:val="en-US"/>
-              </w:rPr>
-            </w:pPr>
-            <w:r>
-              <w:rPr>
-                <w:lang w:val="en-US"/>
-              </w:rPr>
-              <w:t>8</w:t>
-            </w:r>
-          </w:p>
-        </w:tc>
-        <w:tc>
-          <w:tcPr>
-            <w:tcW w:w="1507" w:type="dxa"/>
-          </w:tcPr>
-          <w:p>
-            <w:pPr>
-              <w:rPr>
-                <w:lang w:val="en-US"/>
-              </w:rPr>
-            </w:pPr>
-            <w:r>
-              <w:rPr>
-                <w:lang w:val="en-US"/>
-              </w:rPr>
-              <w:t>Lose when HP reach 0</w:t>
-            </w:r>
-          </w:p>
-        </w:tc>
-        <w:tc>
-          <w:tcPr>
-            <w:tcW w:w="3402" w:type="dxa"/>
-          </w:tcPr>
-          <w:p>
-            <w:pPr>
-              <w:rPr>
-                <w:lang w:val="en-US"/>
-              </w:rPr>
-            </w:pPr>
-            <w:r>
-              <w:rPr>
-                <w:lang w:val="en-US"/>
-              </w:rPr>
-              <w:t>Let the enemies reach the last column of the grid. When the HP reaches 0, the application displays a game over screen with the amount of time survived.</w:t>
-            </w:r>
-          </w:p>
-        </w:tc>
-        <w:tc>
-          <w:tcPr>
-            <w:tcW w:w="3680" w:type="dxa"/>
-          </w:tcPr>
-          <w:p>
-            <w:pPr>
-              <w:rPr>
-                <w:lang w:val="en-US"/>
-              </w:rPr>
-            </w:pPr>
-            <w:r>
-              <w:rPr>
-                <w:lang w:val="en-US"/>
-              </w:rPr>
-              <w:t xml:space="preserve">The HP bar of the player is displayed at the top. When an enemy reaches the last column of the grid, </w:t>
-            </w:r>
-            <w:r>
-              <w:rPr>
-                <w:lang w:val="en-US"/>
-              </w:rPr>
-              <w:t>the amount of HP that enemy had is removed from the HP of the player.</w:t>
-            </w:r>
-          </w:p>
-        </w:tc>
-      </w:tr>
-      <w:tr>
-        <w:tc>
-          <w:tcPr>
-            <w:tcW w:w="473" w:type="dxa"/>
-          </w:tcPr>
-          <w:p>
-            <w:pPr>
-              <w:rPr>
-                <w:lang w:val="en-US"/>
-              </w:rPr>
-            </w:pPr>
-            <w:r>
-              <w:rPr>
-                <w:lang w:val="en-US"/>
-              </w:rPr>
-              <w:t>9</w:t>
-            </w:r>
-          </w:p>
-        </w:tc>
-        <w:tc>
-          <w:tcPr>
-            <w:tcW w:w="1507" w:type="dxa"/>
-          </w:tcPr>
-          <w:p>
-            <w:pPr>
-              <w:rPr>
-                <w:lang w:val="en-US"/>
-              </w:rPr>
-            </w:pPr>
-            <w:r>
-              <w:rPr>
-                <w:lang w:val="en-US"/>
-              </w:rPr>
-              <w:t>Upgrade for towers</w:t>
-            </w:r>
-          </w:p>
-        </w:tc>
-        <w:tc>
-          <w:tcPr>
-            <w:tcW w:w="3402" w:type="dxa"/>
-          </w:tcPr>
-          <w:p>
-            <w:pPr>
-              <w:rPr>
-                <w:lang w:val="en-US"/>
-              </w:rPr>
-            </w:pPr>
-            <w:r>
-              <w:rPr>
-                <w:lang w:val="en-US"/>
-              </w:rPr>
-              <w:t xml:space="preserve">Place a tower. Click on it. A button “upgrade” with the amount of money that costs </w:t>
-            </w:r>
-            <w:proofErr w:type="gramStart"/>
-            <w:r>
-              <w:rPr>
-                <w:lang w:val="en-US"/>
-              </w:rPr>
-              <w:t>is</w:t>
-            </w:r>
-            <w:proofErr w:type="gramEnd"/>
-            <w:r>
-              <w:rPr>
-                <w:lang w:val="en-US"/>
-              </w:rPr>
-              <w:t xml:space="preserve"> displayed. When clicking on it, a sound should be </w:t>
-            </w:r>
-            <w:proofErr w:type="gramStart"/>
-            <w:r>
-              <w:rPr>
-                <w:lang w:val="en-US"/>
-              </w:rPr>
-              <w:t>played</w:t>
-            </w:r>
-            <w:proofErr w:type="gramEnd"/>
-            <w:r>
-              <w:rPr>
-                <w:lang w:val="en-US"/>
-              </w:rPr>
-              <w:t xml:space="preserve"> and the tower should be upgraded.</w:t>
-            </w:r>
-          </w:p>
-        </w:tc>
-        <w:tc>
-          <w:tcPr>
-            <w:tcW w:w="3680" w:type="dxa"/>
-          </w:tcPr>
-          <w:p>
-            <w:pPr>
-              <w:rPr>
-                <w:lang w:val="en-US"/>
-              </w:rPr>
-            </w:pPr>
-            <w:r>
-              <w:rPr>
-                <w:lang w:val="en-US"/>
-              </w:rPr>
-              <w:t>Upgrade tower:</w:t>
+              <w:t>+Damage</w:t>
             </w:r>
           </w:p>
           <w:p>
@@ -1165,43 +1174,13 @@
               <w:rPr>
                 <w:lang w:val="en-US"/>
               </w:rPr>
-              <w:t>+Range</w:t>
-            </w:r>
-          </w:p>
-          <w:p>
-            <w:pPr>
-              <w:pStyle w:val="Paragraphedeliste"/>
-              <w:numPr>
-                <w:ilvl w:val="0"/>
-                <w:numId w:val="1"/>
-              </w:numPr>
-              <w:rPr>
-                <w:lang w:val="en-US"/>
-              </w:rPr>
-            </w:pPr>
-            <w:r>
-              <w:rPr>
-                <w:lang w:val="en-US"/>
-              </w:rPr>
-              <w:t>+Damage</w:t>
-            </w:r>
-          </w:p>
-          <w:p>
-            <w:pPr>
-              <w:pStyle w:val="Paragraphedeliste"/>
-              <w:numPr>
-                <w:ilvl w:val="0"/>
-                <w:numId w:val="1"/>
-              </w:numPr>
-              <w:rPr>
-                <w:lang w:val="en-US"/>
-              </w:rPr>
-            </w:pPr>
-            <w:r>
-              <w:rPr>
-                <w:lang w:val="en-US"/>
-              </w:rPr>
-              <w:t>-Cooldown</w:t>
+              <w:t>-</w:t>
+            </w:r>
+            <w:r>
+              <w:rPr>
+                <w:lang w:val="en-US"/>
+              </w:rPr>
+              <w:t>Cooldown</w:t>
             </w:r>
           </w:p>
         </w:tc>
@@ -1221,7 +1200,13 @@
               <w:rPr>
                 <w:lang w:val="en-US"/>
               </w:rPr>
-              <w:t>10</w:t>
+              <w:t>1</w:t>
+            </w:r>
+            <w:r>
+              <w:rPr>
+                <w:lang w:val="en-US"/>
+              </w:rPr>
+              <w:t>0</w:t>
             </w:r>
           </w:p>
         </w:tc>
@@ -1239,7 +1224,7 @@
               <w:rPr>
                 <w:lang w:val="en-US"/>
               </w:rPr>
-              <w:t>Different type of towers</w:t>
+              <w:t>Different types of enemies</w:t>
             </w:r>
           </w:p>
         </w:tc>
@@ -1257,7 +1242,13 @@
               <w:rPr>
                 <w:lang w:val="en-US"/>
               </w:rPr>
-              <w:t>The player chooses a tower by clicking on it in the available towers. They click on a cell. The tower appears inside the cell. They choose another type of tower. They place it.</w:t>
+              <w:t xml:space="preserve">Launch the game. </w:t>
+            </w:r>
+            <w:r>
+              <w:rPr>
+                <w:lang w:val="en-US"/>
+              </w:rPr>
+              <w:t>Fast enemies spawn after 1 minute, and tank enemies spawn after 2 minutes.</w:t>
             </w:r>
           </w:p>
         </w:tc>
@@ -1267,140 +1258,15 @@
           </w:tcPr>
           <w:p>
             <w:pPr>
-              <w:pStyle w:val="Paragraphedeliste"/>
-              <w:numPr>
-                <w:ilvl w:val="0"/>
-                <w:numId w:val="1"/>
-              </w:numPr>
-              <w:rPr>
-                <w:lang w:val="en-US"/>
-              </w:rPr>
-            </w:pPr>
-            <w:r>
-              <w:rPr>
-                <w:lang w:val="en-US"/>
-              </w:rPr>
-              <w:t>Some towers cost more to place, but they have better initial stats than others.</w:t>
-            </w:r>
-          </w:p>
-          <w:p>
-            <w:pPr>
-              <w:pStyle w:val="Paragraphedeliste"/>
-              <w:numPr>
-                <w:ilvl w:val="0"/>
-                <w:numId w:val="1"/>
-              </w:numPr>
-              <w:rPr>
-                <w:lang w:val="en-US"/>
-              </w:rPr>
-            </w:pPr>
-            <w:r>
-              <w:rPr>
-                <w:lang w:val="en-US"/>
-              </w:rPr>
-              <w:t xml:space="preserve">Some towers act differently (shoots a beam instead of bullets, applies a fire effect, </w:t>
-            </w:r>
-            <w:proofErr w:type="spellStart"/>
-            <w:r>
-              <w:rPr>
-                <w:lang w:val="en-US"/>
-              </w:rPr>
-              <w:t>etc</w:t>
-            </w:r>
-            <w:proofErr w:type="spellEnd"/>
-            <w:r>
-              <w:rPr>
-                <w:lang w:val="en-US"/>
-              </w:rPr>
-              <w:t>…)</w:t>
-            </w:r>
-          </w:p>
-        </w:tc>
-      </w:tr>
-      <w:tr>
-        <w:tc>
-          <w:tcPr>
-            <w:tcW w:w="473" w:type="dxa"/>
-          </w:tcPr>
-          <w:p>
-            <w:pPr>
-              <w:rPr>
-                <w:lang w:val="en-US"/>
-              </w:rPr>
-            </w:pPr>
-            <w:r>
-              <w:rPr>
-                <w:lang w:val="en-US"/>
-              </w:rPr>
-              <w:t>11</w:t>
-            </w:r>
-          </w:p>
-        </w:tc>
-        <w:tc>
-          <w:tcPr>
-            <w:tcW w:w="1507" w:type="dxa"/>
-          </w:tcPr>
-          <w:p>
-            <w:pPr>
-              <w:rPr>
-                <w:lang w:val="en-US"/>
-              </w:rPr>
-            </w:pPr>
-            <w:r>
-              <w:rPr>
-                <w:lang w:val="en-US"/>
-              </w:rPr>
-              <w:t>Different type of enemies</w:t>
-            </w:r>
-          </w:p>
-        </w:tc>
-        <w:tc>
-          <w:tcPr>
-            <w:tcW w:w="3402" w:type="dxa"/>
-          </w:tcPr>
-          <w:p>
-            <w:pPr>
-              <w:rPr>
-                <w:lang w:val="en-US"/>
-              </w:rPr>
-            </w:pPr>
-            <w:r>
-              <w:rPr>
-                <w:lang w:val="en-US"/>
-              </w:rPr>
-              <w:t xml:space="preserve">Launch the game. Different type of </w:t>
-            </w:r>
-            <w:proofErr w:type="gramStart"/>
-            <w:r>
-              <w:rPr>
-                <w:lang w:val="en-US"/>
-              </w:rPr>
-              <w:t>enemies</w:t>
-            </w:r>
-            <w:proofErr w:type="gramEnd"/>
-            <w:r>
-              <w:rPr>
-                <w:lang w:val="en-US"/>
-              </w:rPr>
-              <w:t xml:space="preserve"> spawn after a certain amount of time.</w:t>
-            </w:r>
-          </w:p>
-        </w:tc>
-        <w:tc>
-          <w:tcPr>
-            <w:tcW w:w="3680" w:type="dxa"/>
-          </w:tcPr>
-          <w:p>
-            <w:pPr>
-              <w:rPr>
-                <w:lang w:val="en-US"/>
-              </w:rPr>
-            </w:pPr>
-            <w:r>
-              <w:rPr>
-                <w:lang w:val="en-US"/>
-              </w:rPr>
-              <w:t>Some has more HP, others are quicker.</w:t>
+              <w:rPr>
+                <w:lang w:val="en-US"/>
+              </w:rPr>
+            </w:pPr>
+            <w:r>
+              <w:rPr>
+                <w:lang w:val="en-US"/>
+              </w:rPr>
+              <w:t>Some have more HP, others are quicker.</w:t>
             </w:r>
           </w:p>
         </w:tc>

</xml_diff>